<commit_message>
Finished protocol for this week
</commit_message>
<xml_diff>
--- a/Documents/Protokolle/Protokoll2_27.05.2026/Protokoll27_05_2026.docx
+++ b/Documents/Protokolle/Protokoll2_27.05.2026/Protokoll27_05_2026.docx
@@ -2,6 +2,46 @@
 <file path=word/document.xml><?xml version="1.0" encoding="utf-8"?>
 <w:document xmlns:wpc="http://schemas.microsoft.com/office/word/2010/wordprocessingCanvas" xmlns:cx="http://schemas.microsoft.com/office/drawing/2014/chartex" xmlns:cx1="http://schemas.microsoft.com/office/drawing/2015/9/8/chartex" xmlns:cx2="http://schemas.microsoft.com/office/drawing/2015/10/21/chartex" xmlns:cx3="http://schemas.microsoft.com/office/drawing/2016/5/9/chartex" xmlns:cx4="http://schemas.microsoft.com/office/drawing/2016/5/10/chartex" xmlns:cx5="http://schemas.microsoft.com/office/drawing/2016/5/11/chartex" xmlns:cx6="http://schemas.microsoft.com/office/drawing/2016/5/12/chartex" xmlns:cx7="http://schemas.microsoft.com/office/drawing/2016/5/13/chartex" xmlns:cx8="http://schemas.microsoft.com/office/drawing/2016/5/14/chartex" xmlns:mc="http://schemas.openxmlformats.org/markup-compatibility/2006" xmlns:aink="http://schemas.microsoft.com/office/drawing/2016/ink" xmlns:am3d="http://schemas.microsoft.com/office/drawing/2017/model3d" xmlns:o="urn:schemas-microsoft-com:office:office" xmlns:oel="http://schemas.microsoft.com/office/2019/extlst" xmlns:r="http://schemas.openxmlformats.org/officeDocument/2006/relationships" xmlns:m="http://schemas.openxmlformats.org/officeDocument/2006/math" xmlns:v="urn:schemas-microsoft-com:vml" xmlns:wp14="http://schemas.microsoft.com/office/word/2010/wordprocessingDrawing" xmlns:wp="http://schemas.openxmlformats.org/drawingml/2006/wordprocessingDrawing" xmlns:w10="urn:schemas-microsoft-com:office:word" xmlns:w="http://schemas.openxmlformats.org/wordprocessingml/2006/main" xmlns:w14="http://schemas.microsoft.com/office/word/2010/wordml" xmlns:w15="http://schemas.microsoft.com/office/word/2012/wordml" xmlns:w16cex="http://schemas.microsoft.com/office/word/2018/wordml/cex" xmlns:w16cid="http://schemas.microsoft.com/office/word/2016/wordml/cid" xmlns:w16="http://schemas.microsoft.com/office/word/2018/wordml" xmlns:w16du="http://schemas.microsoft.com/office/word/2023/wordml/word16du" xmlns:w16sdtdh="http://schemas.microsoft.com/office/word/2020/wordml/sdtdatahash" xmlns:w16sdtfl="http://schemas.microsoft.com/office/word/2024/wordml/sdtformatlock" xmlns:w16se="http://schemas.microsoft.com/office/word/2015/wordml/symex" xmlns:wpg="http://schemas.microsoft.com/office/word/2010/wordprocessingGroup" xmlns:wpi="http://schemas.microsoft.com/office/word/2010/wordprocessingInk" xmlns:wne="http://schemas.microsoft.com/office/word/2006/wordml" xmlns:wps="http://schemas.microsoft.com/office/word/2010/wordprocessingShape" mc:Ignorable="w14 w15 w16se w16cid w16 w16cex w16sdtdh w16sdtfl w16du wp14">
   <w:body>
+    <w:p>
+      <w:pPr>
+        <w:rPr>
+          <w:b/>
+          <w:bCs/>
+          <w:i/>
+          <w:iCs/>
+          <w:lang w:val="de-DE"/>
+        </w:rPr>
+      </w:pPr>
+      <w:r>
+        <w:rPr>
+          <w:b/>
+          <w:bCs/>
+          <w:i/>
+          <w:iCs/>
+          <w:lang w:val="de-DE"/>
+        </w:rPr>
+        <w:t>Was wurde gemacht?</w:t>
+      </w:r>
+    </w:p>
+    <w:p>
+      <w:pPr>
+        <w:rPr>
+          <w:lang w:val="de-DE"/>
+        </w:rPr>
+      </w:pPr>
+      <w:r>
+        <w:rPr>
+          <w:lang w:val="de-DE"/>
+        </w:rPr>
+        <w:t>In dieser Woche wurden</w:t>
+      </w:r>
+      <w:r>
+        <w:rPr>
+          <w:lang w:val="de-DE"/>
+        </w:rPr>
+        <w:t xml:space="preserve"> im Projekt folgende Funktionen aus Sicht des Users implementiert</w:t>
+      </w:r>
+    </w:p>
     <w:p>
       <w:pPr>
         <w:pStyle w:val="Listenabsatz"/>
@@ -9,9 +49,93 @@
           <w:ilvl w:val="0"/>
           <w:numId w:val="1"/>
         </w:numPr>
-      </w:pPr>
-      <w:r>
-        <w:t>Endpunkte für Dashbaord erstellt</w:t>
+        <w:rPr>
+          <w:lang w:val="de-DE"/>
+        </w:rPr>
+      </w:pPr>
+      <w:r>
+        <w:rPr>
+          <w:lang w:val="de-DE"/>
+        </w:rPr>
+        <w:t>Dashboard View</w:t>
+      </w:r>
+    </w:p>
+    <w:p>
+      <w:pPr>
+        <w:pStyle w:val="Listenabsatz"/>
+        <w:numPr>
+          <w:ilvl w:val="1"/>
+          <w:numId w:val="1"/>
+        </w:numPr>
+        <w:rPr>
+          <w:lang w:val="de-DE"/>
+        </w:rPr>
+      </w:pPr>
+      <w:r>
+        <w:rPr>
+          <w:lang w:val="de-DE"/>
+        </w:rPr>
+        <w:t>Die nächsten Tasks werden nun in Form einer Liste angezeigt (es werden die nächsten drei anstehenden Tasks angezeigt)</w:t>
+      </w:r>
+    </w:p>
+    <w:p>
+      <w:pPr>
+        <w:pStyle w:val="Listenabsatz"/>
+        <w:numPr>
+          <w:ilvl w:val="1"/>
+          <w:numId w:val="1"/>
+        </w:numPr>
+        <w:rPr>
+          <w:lang w:val="de-DE"/>
+        </w:rPr>
+      </w:pPr>
+      <w:r>
+        <w:rPr>
+          <w:lang w:val="de-DE"/>
+        </w:rPr>
+        <w:t>Die Priorität aller Tasks des angemeldeten Users wird in Form eines Tortendiagramms dargestellt</w:t>
+      </w:r>
+    </w:p>
+    <w:p>
+      <w:pPr>
+        <w:pStyle w:val="Listenabsatz"/>
+        <w:numPr>
+          <w:ilvl w:val="1"/>
+          <w:numId w:val="1"/>
+        </w:numPr>
+        <w:rPr>
+          <w:lang w:val="de-DE"/>
+        </w:rPr>
+      </w:pPr>
+      <w:r>
+        <w:rPr>
+          <w:lang w:val="de-DE"/>
+        </w:rPr>
+        <w:t>Task Overview zeigt eine Statistik über den derzeitigen Status der Tasks an</w:t>
+      </w:r>
+    </w:p>
+    <w:p>
+      <w:pPr>
+        <w:pStyle w:val="Listenabsatz"/>
+        <w:numPr>
+          <w:ilvl w:val="1"/>
+          <w:numId w:val="1"/>
+        </w:numPr>
+        <w:rPr>
+          <w:lang w:val="de-DE"/>
+        </w:rPr>
+      </w:pPr>
+      <w:r>
+        <w:rPr>
+          <w:lang w:val="de-DE"/>
+        </w:rPr>
+        <w:t>Tasks Progress zeigt in Form e</w:t>
+      </w:r>
+      <w:r>
+        <w:rPr>
+          <w:lang w:val="de-DE"/>
+        </w:rPr>
+        <w:t>ines Liniendiagramms die Anzahl der erledigten Tasks in verschiedenen Zeitspannen an.</w:t>
       </w:r>
     </w:p>
     <w:p>
@@ -29,7 +153,61 @@
         <w:rPr>
           <w:lang w:val="de-DE"/>
         </w:rPr>
-        <w:t>Task leiste erstellt</w:t>
+        <w:t>Settings View</w:t>
+      </w:r>
+    </w:p>
+    <w:p>
+      <w:pPr>
+        <w:pStyle w:val="Listenabsatz"/>
+        <w:numPr>
+          <w:ilvl w:val="1"/>
+          <w:numId w:val="1"/>
+        </w:numPr>
+        <w:rPr>
+          <w:lang w:val="de-DE"/>
+        </w:rPr>
+      </w:pPr>
+      <w:r>
+        <w:rPr>
+          <w:lang w:val="de-DE"/>
+        </w:rPr>
+        <w:t>Anzeigen der aktuellen User Informationen</w:t>
+      </w:r>
+    </w:p>
+    <w:p>
+      <w:pPr>
+        <w:pStyle w:val="Listenabsatz"/>
+        <w:numPr>
+          <w:ilvl w:val="1"/>
+          <w:numId w:val="1"/>
+        </w:numPr>
+        <w:rPr>
+          <w:lang w:val="de-DE"/>
+        </w:rPr>
+      </w:pPr>
+      <w:r>
+        <w:rPr>
+          <w:lang w:val="de-DE"/>
+        </w:rPr>
+        <w:t>Bearbeiten der aktuellen User Informationen</w:t>
+      </w:r>
+    </w:p>
+    <w:p>
+      <w:pPr>
+        <w:pStyle w:val="Listenabsatz"/>
+        <w:numPr>
+          <w:ilvl w:val="1"/>
+          <w:numId w:val="1"/>
+        </w:numPr>
+        <w:rPr>
+          <w:lang w:val="de-DE"/>
+        </w:rPr>
+      </w:pPr>
+      <w:r>
+        <w:rPr>
+          <w:lang w:val="de-DE"/>
+        </w:rPr>
+        <w:t>Löschen des Users</w:t>
       </w:r>
     </w:p>
     <w:p>
@@ -47,13 +225,126 @@
         <w:rPr>
           <w:lang w:val="de-DE"/>
         </w:rPr>
-        <w:t>Seeder erstellt</w:t>
-      </w:r>
-      <w:r>
-        <w:rPr>
-          <w:lang w:val="de-DE"/>
-        </w:rPr>
-        <w:t xml:space="preserve"> (mithilfe von KI)</w:t>
+        <w:t>Language Translation</w:t>
+      </w:r>
+    </w:p>
+    <w:p>
+      <w:pPr>
+        <w:pStyle w:val="Listenabsatz"/>
+        <w:numPr>
+          <w:ilvl w:val="1"/>
+          <w:numId w:val="1"/>
+        </w:numPr>
+        <w:rPr>
+          <w:lang w:val="de-DE"/>
+        </w:rPr>
+      </w:pPr>
+      <w:r>
+        <w:rPr>
+          <w:lang w:val="de-DE"/>
+        </w:rPr>
+        <w:t xml:space="preserve">Durch klick auf EN / DE Button in der Tastbar ist es möglich die Interface Sprache zu wechseln. Die zuletzt ausgewählte Sprache wird gespeichert und bei erneutem Anmelden des Users aufgerufen und geladen.         </w:t>
+      </w:r>
+      <w:r>
+        <w:rPr>
+          <w:lang w:val="de-DE"/>
+        </w:rPr>
+        <w:tab/>
+      </w:r>
+    </w:p>
+    <w:p>
+      <w:pPr>
+        <w:pStyle w:val="Listenabsatz"/>
+        <w:ind w:left="1440"/>
+        <w:rPr>
+          <w:b/>
+          <w:bCs/>
+          <w:lang w:val="de-DE"/>
+        </w:rPr>
+      </w:pPr>
+      <w:r>
+        <w:rPr>
+          <w:b/>
+          <w:bCs/>
+          <w:lang w:val="de-DE"/>
+        </w:rPr>
+        <w:t>(Im Projektkonzept ist das Wechseln der Sprache in den Einstellungen aufzufinden, dies wurde in die Taskleiste verschoben da es intuitiver für den User ist)</w:t>
+      </w:r>
+    </w:p>
+    <w:p>
+      <w:pPr>
+        <w:pStyle w:val="Listenabsatz"/>
+        <w:ind w:left="1440"/>
+        <w:rPr>
+          <w:b/>
+          <w:bCs/>
+          <w:lang w:val="de-DE"/>
+        </w:rPr>
+      </w:pPr>
+    </w:p>
+    <w:p>
+      <w:pPr>
+        <w:rPr>
+          <w:lang w:val="de-DE"/>
+        </w:rPr>
+      </w:pPr>
+      <w:r>
+        <w:rPr>
+          <w:b/>
+          <w:bCs/>
+          <w:lang w:val="de-DE"/>
+        </w:rPr>
+        <w:t>Im Backend</w:t>
+      </w:r>
+      <w:r>
+        <w:rPr>
+          <w:lang w:val="de-DE"/>
+        </w:rPr>
+        <w:t xml:space="preserve"> wurden für die oben genannten Diagramme, Statistiken, User Settings etc. die dementsprechenden Endpoints erstellt. Zudem wurde der DB Seeder geupdatet, um Mehrer </w:t>
+      </w:r>
+      <w:r>
+        <w:rPr>
+          <w:lang w:val="de-DE"/>
+        </w:rPr>
+        <w:t>Task zu</w:t>
+      </w:r>
+      <w:r>
+        <w:rPr>
+          <w:lang w:val="de-DE"/>
+        </w:rPr>
+        <w:t xml:space="preserve"> </w:t>
+      </w:r>
+      <w:r>
+        <w:rPr>
+          <w:lang w:val="de-DE"/>
+        </w:rPr>
+        <w:t>generieren,</w:t>
+      </w:r>
+      <w:r>
+        <w:rPr>
+          <w:lang w:val="de-DE"/>
+        </w:rPr>
+        <w:t xml:space="preserve"> um einen schöneren Task Progress zu sehen.</w:t>
+      </w:r>
+    </w:p>
+    <w:p>
+      <w:pPr>
+        <w:rPr>
+          <w:lang w:val="de-DE"/>
+        </w:rPr>
+      </w:pPr>
+    </w:p>
+    <w:p>
+      <w:pPr>
+        <w:rPr>
+          <w:lang w:val="de-DE"/>
+        </w:rPr>
+      </w:pPr>
+      <w:r>
+        <w:rPr>
+          <w:lang w:val="de-DE"/>
+        </w:rPr>
+        <w:t xml:space="preserve">Die verwendetet KI hierfür ist die „Gemini CLI“ da diese direkt auf dem Filesystem installiert wird hat sie direkt Zugriff auf alle wichtigen Dateien, was das Arbeiten erleichtert. Commands die Ich hierfür benutzt habe sind </w:t>
       </w:r>
     </w:p>
     <w:p>
@@ -61,14 +352,47 @@
         <w:pStyle w:val="Listenabsatz"/>
         <w:numPr>
           <w:ilvl w:val="0"/>
-          <w:numId w:val="1"/>
+          <w:numId w:val="2"/>
         </w:numPr>
-      </w:pPr>
-      <w:r>
-        <w:t>Shared Runes user Data er</w:t>
-      </w:r>
-      <w:r>
-        <w:t>stellt</w:t>
+        <w:rPr>
+          <w:lang w:val="de-DE"/>
+        </w:rPr>
+      </w:pPr>
+      <w:r>
+        <w:rPr>
+          <w:lang w:val="de-DE"/>
+        </w:rPr>
+        <w:t xml:space="preserve">„Hilf mir bei dem Bug Fix im </w:t>
+      </w:r>
+      <w:r>
+        <w:rPr>
+          <w:lang w:val="de-DE"/>
+        </w:rPr>
+        <w:t>Frontend</w:t>
+      </w:r>
+      <w:r>
+        <w:rPr>
+          <w:lang w:val="de-DE"/>
+        </w:rPr>
+        <w:t xml:space="preserve">, </w:t>
+      </w:r>
+      <w:r>
+        <w:rPr>
+          <w:lang w:val="de-DE"/>
+        </w:rPr>
+        <w:t xml:space="preserve">welcher Auftritt, wenn ich von Dashboard nach Settings und wieder zurück auf Dashboard navigiere“ </w:t>
+      </w:r>
+      <w:r>
+        <w:rPr>
+          <w:lang w:val="de-DE"/>
+        </w:rPr>
+        <w:sym w:font="Wingdings" w:char="F0E0"/>
+      </w:r>
+      <w:r>
+        <w:rPr>
+          <w:lang w:val="de-DE"/>
+        </w:rPr>
+        <w:t xml:space="preserve"> Resultierte in einem 500 Error. (Gemini CLI)</w:t>
       </w:r>
     </w:p>
     <w:p>
@@ -76,7 +400,7 @@
         <w:pStyle w:val="Listenabsatz"/>
         <w:numPr>
           <w:ilvl w:val="0"/>
-          <w:numId w:val="1"/>
+          <w:numId w:val="2"/>
         </w:numPr>
         <w:rPr>
           <w:lang w:val="de-DE"/>
@@ -86,13 +410,19 @@
         <w:rPr>
           <w:lang w:val="de-DE"/>
         </w:rPr>
-        <w:t>Dasboard FE gefetchedte daten ange</w:t>
-      </w:r>
-      <w:r>
-        <w:rPr>
-          <w:lang w:val="de-DE"/>
-        </w:rPr>
-        <w:t>zeigt</w:t>
+        <w:t>„Überarbeitet das Design</w:t>
+      </w:r>
+      <w:r>
+        <w:rPr>
+          <w:lang w:val="de-DE"/>
+        </w:rPr>
+        <w:t xml:space="preserve"> im Dashboard und Settings Screen,</w:t>
+      </w:r>
+      <w:r>
+        <w:rPr>
+          <w:lang w:val="de-DE"/>
+        </w:rPr>
+        <w:t xml:space="preserve"> wie es im Screenshoot sichtbar ist, ändere nichts am Code nur design“ (Gemini)</w:t>
       </w:r>
     </w:p>
     <w:p>
@@ -100,21 +430,178 @@
         <w:pStyle w:val="Listenabsatz"/>
         <w:numPr>
           <w:ilvl w:val="0"/>
-          <w:numId w:val="1"/>
+          <w:numId w:val="2"/>
         </w:numPr>
         <w:rPr>
           <w:lang w:val="de-DE"/>
         </w:rPr>
       </w:pPr>
-    </w:p>
-    <w:p>
-      <w:pPr>
-        <w:rPr>
-          <w:lang w:val="de-DE"/>
-        </w:rPr>
-      </w:pPr>
+      <w:r>
+        <w:rPr>
+          <w:lang w:val="de-DE"/>
+        </w:rPr>
+        <w:t>„Erweitere den DB Seeder mit mehreren Tasks, einige davon sollten als Task Done maskiert sein“. (Gemini CLI)</w:t>
+      </w:r>
+    </w:p>
+    <w:p>
+      <w:pPr>
+        <w:pStyle w:val="Listenabsatz"/>
+        <w:ind w:left="1080"/>
+        <w:rPr>
+          <w:lang w:val="de-DE"/>
+        </w:rPr>
+      </w:pPr>
+    </w:p>
+    <w:p>
+      <w:pPr>
+        <w:rPr>
+          <w:b/>
+          <w:bCs/>
+          <w:i/>
+          <w:iCs/>
+          <w:lang w:val="de-DE"/>
+        </w:rPr>
+      </w:pPr>
+    </w:p>
+    <w:p>
+      <w:pPr>
+        <w:rPr>
+          <w:b/>
+          <w:bCs/>
+          <w:i/>
+          <w:iCs/>
+          <w:lang w:val="de-DE"/>
+        </w:rPr>
+      </w:pPr>
+      <w:r>
+        <w:rPr>
+          <w:b/>
+          <w:bCs/>
+          <w:i/>
+          <w:iCs/>
+          <w:lang w:val="de-DE"/>
+        </w:rPr>
+        <w:t>Wie liegt man im Zeitplan?</w:t>
+      </w:r>
+    </w:p>
+    <w:p>
+      <w:pPr>
+        <w:rPr>
+          <w:lang w:val="de-DE"/>
+        </w:rPr>
+      </w:pPr>
+      <w:r>
+        <w:rPr>
+          <w:lang w:val="de-DE"/>
+        </w:rPr>
+        <w:t xml:space="preserve">Stand </w:t>
+      </w:r>
+      <w:r>
+        <w:rPr>
+          <w:lang w:val="de-DE"/>
+        </w:rPr>
+        <w:t>28</w:t>
+      </w:r>
+      <w:r>
+        <w:rPr>
+          <w:lang w:val="de-DE"/>
+        </w:rPr>
+        <w:t xml:space="preserve">.5.2026, liege ich </w:t>
+      </w:r>
+      <w:r>
+        <w:rPr>
+          <w:lang w:val="de-DE"/>
+        </w:rPr>
+        <w:t>nicht ganz im Zeitplan</w:t>
+      </w:r>
+      <w:r>
+        <w:rPr>
+          <w:lang w:val="de-DE"/>
+        </w:rPr>
+        <w:t xml:space="preserve">, </w:t>
+      </w:r>
+      <w:r>
+        <w:rPr>
+          <w:lang w:val="de-DE"/>
+        </w:rPr>
+        <w:t xml:space="preserve">laut Meilenstand, sollten Dashboard, Settings, Team-Verwaltung – Screen, i18n </w:t>
+      </w:r>
+      <w:proofErr w:type="spellStart"/>
+      <w:r>
+        <w:rPr>
+          <w:lang w:val="de-DE"/>
+        </w:rPr>
+        <w:t>Svelte</w:t>
+      </w:r>
+      <w:proofErr w:type="spellEnd"/>
+      <w:r>
+        <w:rPr>
+          <w:lang w:val="de-DE"/>
+        </w:rPr>
+        <w:t xml:space="preserve"> Übersetzung bis zum 29.5.2026 fertiggestellt sein. Dies ist nicht der Fall, da die Team Verwaltung noch nicht implementiert wurde.</w:t>
+      </w:r>
+    </w:p>
+    <w:p>
+      <w:pPr>
+        <w:rPr>
+          <w:b/>
+          <w:bCs/>
+          <w:i/>
+          <w:iCs/>
+          <w:lang w:val="de-DE"/>
+        </w:rPr>
+      </w:pPr>
+      <w:r>
+        <w:rPr>
+          <w:b/>
+          <w:bCs/>
+          <w:i/>
+          <w:iCs/>
+          <w:lang w:val="de-DE"/>
+        </w:rPr>
+        <w:t>Was sind die nächsten Schritte?</w:t>
+      </w:r>
+    </w:p>
+    <w:p>
+      <w:pPr>
+        <w:rPr>
+          <w:lang w:val="de-DE"/>
+        </w:rPr>
+      </w:pPr>
+      <w:r>
+        <w:rPr>
+          <w:lang w:val="de-DE"/>
+        </w:rPr>
+        <w:t xml:space="preserve">Zunächst wird die Team Verwaltung, die noch nicht erledigt wurde in der kommenden Woche erledigt. Im Anschluss soll der </w:t>
+      </w:r>
+      <w:r>
+        <w:rPr>
+          <w:lang w:val="de-DE"/>
+        </w:rPr>
+        <w:t xml:space="preserve">Project </w:t>
+      </w:r>
+      <w:r>
+        <w:rPr>
+          <w:lang w:val="de-DE"/>
+        </w:rPr>
+        <w:t>Overview Screen sowie</w:t>
+      </w:r>
+      <w:r>
+        <w:rPr>
+          <w:lang w:val="de-DE"/>
+        </w:rPr>
+        <w:t xml:space="preserve"> CRUD-Operationen für Projekte und Tasks</w:t>
+      </w:r>
+      <w:r>
+        <w:rPr>
+          <w:lang w:val="de-DE"/>
+        </w:rPr>
+        <w:t xml:space="preserve"> im Backend implementiert werden.</w:t>
+      </w:r>
     </w:p>
     <w:sectPr>
+      <w:headerReference w:type="default" r:id="rId7"/>
+      <w:footerReference w:type="default" r:id="rId8"/>
       <w:pgSz w:w="11906" w:h="16838"/>
       <w:pgMar w:top="1417" w:right="1417" w:bottom="1134" w:left="1417" w:header="708" w:footer="708" w:gutter="0"/>
       <w:cols w:space="708"/>
@@ -122,6 +609,105 @@
     </w:sectPr>
   </w:body>
 </w:document>
+</file>
+
+<file path=word/endnotes.xml><?xml version="1.0" encoding="utf-8"?>
+<w:endnotes xmlns:wpc="http://schemas.microsoft.com/office/word/2010/wordprocessingCanvas" xmlns:cx="http://schemas.microsoft.com/office/drawing/2014/chartex" xmlns:cx1="http://schemas.microsoft.com/office/drawing/2015/9/8/chartex" xmlns:cx2="http://schemas.microsoft.com/office/drawing/2015/10/21/chartex" xmlns:cx3="http://schemas.microsoft.com/office/drawing/2016/5/9/chartex" xmlns:cx4="http://schemas.microsoft.com/office/drawing/2016/5/10/chartex" xmlns:cx5="http://schemas.microsoft.com/office/drawing/2016/5/11/chartex" xmlns:cx6="http://schemas.microsoft.com/office/drawing/2016/5/12/chartex" xmlns:cx7="http://schemas.microsoft.com/office/drawing/2016/5/13/chartex" xmlns:cx8="http://schemas.microsoft.com/office/drawing/2016/5/14/chartex" xmlns:mc="http://schemas.openxmlformats.org/markup-compatibility/2006" xmlns:aink="http://schemas.microsoft.com/office/drawing/2016/ink" xmlns:am3d="http://schemas.microsoft.com/office/drawing/2017/model3d" xmlns:o="urn:schemas-microsoft-com:office:office" xmlns:oel="http://schemas.microsoft.com/office/2019/extlst" xmlns:r="http://schemas.openxmlformats.org/officeDocument/2006/relationships" xmlns:m="http://schemas.openxmlformats.org/officeDocument/2006/math" xmlns:v="urn:schemas-microsoft-com:vml" xmlns:wp14="http://schemas.microsoft.com/office/word/2010/wordprocessingDrawing" xmlns:wp="http://schemas.openxmlformats.org/drawingml/2006/wordprocessingDrawing" xmlns:w10="urn:schemas-microsoft-com:office:word" xmlns:w="http://schemas.openxmlformats.org/wordprocessingml/2006/main" xmlns:w14="http://schemas.microsoft.com/office/word/2010/wordml" xmlns:w15="http://schemas.microsoft.com/office/word/2012/wordml" xmlns:w16cex="http://schemas.microsoft.com/office/word/2018/wordml/cex" xmlns:w16cid="http://schemas.microsoft.com/office/word/2016/wordml/cid" xmlns:w16="http://schemas.microsoft.com/office/word/2018/wordml" xmlns:w16du="http://schemas.microsoft.com/office/word/2023/wordml/word16du" xmlns:w16sdtdh="http://schemas.microsoft.com/office/word/2020/wordml/sdtdatahash" xmlns:w16sdtfl="http://schemas.microsoft.com/office/word/2024/wordml/sdtformatlock" xmlns:w16se="http://schemas.microsoft.com/office/word/2015/wordml/symex" xmlns:wpg="http://schemas.microsoft.com/office/word/2010/wordprocessingGroup" xmlns:wpi="http://schemas.microsoft.com/office/word/2010/wordprocessingInk" xmlns:wne="http://schemas.microsoft.com/office/word/2006/wordml" xmlns:wps="http://schemas.microsoft.com/office/word/2010/wordprocessingShape" mc:Ignorable="w14 w15 w16se w16cid w16 w16cex w16sdtdh w16sdtfl w16du wp14">
+  <w:endnote w:type="separator" w:id="-1">
+    <w:p>
+      <w:pPr>
+        <w:spacing w:after="0" w:line="240" w:lineRule="auto"/>
+      </w:pPr>
+      <w:r>
+        <w:separator/>
+      </w:r>
+    </w:p>
+  </w:endnote>
+  <w:endnote w:type="continuationSeparator" w:id="0">
+    <w:p>
+      <w:pPr>
+        <w:spacing w:after="0" w:line="240" w:lineRule="auto"/>
+      </w:pPr>
+      <w:r>
+        <w:continuationSeparator/>
+      </w:r>
+    </w:p>
+  </w:endnote>
+</w:endnotes>
+</file>
+
+<file path=word/footer1.xml><?xml version="1.0" encoding="utf-8"?>
+<w:ftr xmlns:wpc="http://schemas.microsoft.com/office/word/2010/wordprocessingCanvas" xmlns:cx="http://schemas.microsoft.com/office/drawing/2014/chartex" xmlns:cx1="http://schemas.microsoft.com/office/drawing/2015/9/8/chartex" xmlns:cx2="http://schemas.microsoft.com/office/drawing/2015/10/21/chartex" xmlns:cx3="http://schemas.microsoft.com/office/drawing/2016/5/9/chartex" xmlns:cx4="http://schemas.microsoft.com/office/drawing/2016/5/10/chartex" xmlns:cx5="http://schemas.microsoft.com/office/drawing/2016/5/11/chartex" xmlns:cx6="http://schemas.microsoft.com/office/drawing/2016/5/12/chartex" xmlns:cx7="http://schemas.microsoft.com/office/drawing/2016/5/13/chartex" xmlns:cx8="http://schemas.microsoft.com/office/drawing/2016/5/14/chartex" xmlns:mc="http://schemas.openxmlformats.org/markup-compatibility/2006" xmlns:aink="http://schemas.microsoft.com/office/drawing/2016/ink" xmlns:am3d="http://schemas.microsoft.com/office/drawing/2017/model3d" xmlns:o="urn:schemas-microsoft-com:office:office" xmlns:oel="http://schemas.microsoft.com/office/2019/extlst" xmlns:r="http://schemas.openxmlformats.org/officeDocument/2006/relationships" xmlns:m="http://schemas.openxmlformats.org/officeDocument/2006/math" xmlns:v="urn:schemas-microsoft-com:vml" xmlns:wp14="http://schemas.microsoft.com/office/word/2010/wordprocessingDrawing" xmlns:wp="http://schemas.openxmlformats.org/drawingml/2006/wordprocessingDrawing" xmlns:w10="urn:schemas-microsoft-com:office:word" xmlns:w="http://schemas.openxmlformats.org/wordprocessingml/2006/main" xmlns:w14="http://schemas.microsoft.com/office/word/2010/wordml" xmlns:w15="http://schemas.microsoft.com/office/word/2012/wordml" xmlns:w16cex="http://schemas.microsoft.com/office/word/2018/wordml/cex" xmlns:w16cid="http://schemas.microsoft.com/office/word/2016/wordml/cid" xmlns:w16="http://schemas.microsoft.com/office/word/2018/wordml" xmlns:w16du="http://schemas.microsoft.com/office/word/2023/wordml/word16du" xmlns:w16sdtdh="http://schemas.microsoft.com/office/word/2020/wordml/sdtdatahash" xmlns:w16sdtfl="http://schemas.microsoft.com/office/word/2024/wordml/sdtformatlock" xmlns:w16se="http://schemas.microsoft.com/office/word/2015/wordml/symex" xmlns:wpg="http://schemas.microsoft.com/office/word/2010/wordprocessingGroup" xmlns:wpi="http://schemas.microsoft.com/office/word/2010/wordprocessingInk" xmlns:wne="http://schemas.microsoft.com/office/word/2006/wordml" xmlns:wps="http://schemas.microsoft.com/office/word/2010/wordprocessingShape" mc:Ignorable="w14 w15 w16se w16cid w16 w16cex w16sdtdh w16sdtfl w16du wp14">
+  <w:p>
+    <w:pPr>
+      <w:pStyle w:val="Fuzeile"/>
+    </w:pPr>
+    <w:r>
+      <w:rPr>
+        <w:lang w:val="de-DE"/>
+      </w:rPr>
+      <w:t>28.05.2026</w:t>
+    </w:r>
+  </w:p>
+</w:ftr>
+</file>
+
+<file path=word/footnotes.xml><?xml version="1.0" encoding="utf-8"?>
+<w:footnotes xmlns:wpc="http://schemas.microsoft.com/office/word/2010/wordprocessingCanvas" xmlns:cx="http://schemas.microsoft.com/office/drawing/2014/chartex" xmlns:cx1="http://schemas.microsoft.com/office/drawing/2015/9/8/chartex" xmlns:cx2="http://schemas.microsoft.com/office/drawing/2015/10/21/chartex" xmlns:cx3="http://schemas.microsoft.com/office/drawing/2016/5/9/chartex" xmlns:cx4="http://schemas.microsoft.com/office/drawing/2016/5/10/chartex" xmlns:cx5="http://schemas.microsoft.com/office/drawing/2016/5/11/chartex" xmlns:cx6="http://schemas.microsoft.com/office/drawing/2016/5/12/chartex" xmlns:cx7="http://schemas.microsoft.com/office/drawing/2016/5/13/chartex" xmlns:cx8="http://schemas.microsoft.com/office/drawing/2016/5/14/chartex" xmlns:mc="http://schemas.openxmlformats.org/markup-compatibility/2006" xmlns:aink="http://schemas.microsoft.com/office/drawing/2016/ink" xmlns:am3d="http://schemas.microsoft.com/office/drawing/2017/model3d" xmlns:o="urn:schemas-microsoft-com:office:office" xmlns:oel="http://schemas.microsoft.com/office/2019/extlst" xmlns:r="http://schemas.openxmlformats.org/officeDocument/2006/relationships" xmlns:m="http://schemas.openxmlformats.org/officeDocument/2006/math" xmlns:v="urn:schemas-microsoft-com:vml" xmlns:wp14="http://schemas.microsoft.com/office/word/2010/wordprocessingDrawing" xmlns:wp="http://schemas.openxmlformats.org/drawingml/2006/wordprocessingDrawing" xmlns:w10="urn:schemas-microsoft-com:office:word" xmlns:w="http://schemas.openxmlformats.org/wordprocessingml/2006/main" xmlns:w14="http://schemas.microsoft.com/office/word/2010/wordml" xmlns:w15="http://schemas.microsoft.com/office/word/2012/wordml" xmlns:w16cex="http://schemas.microsoft.com/office/word/2018/wordml/cex" xmlns:w16cid="http://schemas.microsoft.com/office/word/2016/wordml/cid" xmlns:w16="http://schemas.microsoft.com/office/word/2018/wordml" xmlns:w16du="http://schemas.microsoft.com/office/word/2023/wordml/word16du" xmlns:w16sdtdh="http://schemas.microsoft.com/office/word/2020/wordml/sdtdatahash" xmlns:w16sdtfl="http://schemas.microsoft.com/office/word/2024/wordml/sdtformatlock" xmlns:w16se="http://schemas.microsoft.com/office/word/2015/wordml/symex" xmlns:wpg="http://schemas.microsoft.com/office/word/2010/wordprocessingGroup" xmlns:wpi="http://schemas.microsoft.com/office/word/2010/wordprocessingInk" xmlns:wne="http://schemas.microsoft.com/office/word/2006/wordml" xmlns:wps="http://schemas.microsoft.com/office/word/2010/wordprocessingShape" mc:Ignorable="w14 w15 w16se w16cid w16 w16cex w16sdtdh w16sdtfl w16du wp14">
+  <w:footnote w:type="separator" w:id="-1">
+    <w:p>
+      <w:pPr>
+        <w:spacing w:after="0" w:line="240" w:lineRule="auto"/>
+      </w:pPr>
+      <w:r>
+        <w:separator/>
+      </w:r>
+    </w:p>
+  </w:footnote>
+  <w:footnote w:type="continuationSeparator" w:id="0">
+    <w:p>
+      <w:pPr>
+        <w:spacing w:after="0" w:line="240" w:lineRule="auto"/>
+      </w:pPr>
+      <w:r>
+        <w:continuationSeparator/>
+      </w:r>
+    </w:p>
+  </w:footnote>
+</w:footnotes>
+</file>
+
+<file path=word/header1.xml><?xml version="1.0" encoding="utf-8"?>
+<w:hdr xmlns:wpc="http://schemas.microsoft.com/office/word/2010/wordprocessingCanvas" xmlns:cx="http://schemas.microsoft.com/office/drawing/2014/chartex" xmlns:cx1="http://schemas.microsoft.com/office/drawing/2015/9/8/chartex" xmlns:cx2="http://schemas.microsoft.com/office/drawing/2015/10/21/chartex" xmlns:cx3="http://schemas.microsoft.com/office/drawing/2016/5/9/chartex" xmlns:cx4="http://schemas.microsoft.com/office/drawing/2016/5/10/chartex" xmlns:cx5="http://schemas.microsoft.com/office/drawing/2016/5/11/chartex" xmlns:cx6="http://schemas.microsoft.com/office/drawing/2016/5/12/chartex" xmlns:cx7="http://schemas.microsoft.com/office/drawing/2016/5/13/chartex" xmlns:cx8="http://schemas.microsoft.com/office/drawing/2016/5/14/chartex" xmlns:mc="http://schemas.openxmlformats.org/markup-compatibility/2006" xmlns:aink="http://schemas.microsoft.com/office/drawing/2016/ink" xmlns:am3d="http://schemas.microsoft.com/office/drawing/2017/model3d" xmlns:o="urn:schemas-microsoft-com:office:office" xmlns:oel="http://schemas.microsoft.com/office/2019/extlst" xmlns:r="http://schemas.openxmlformats.org/officeDocument/2006/relationships" xmlns:m="http://schemas.openxmlformats.org/officeDocument/2006/math" xmlns:v="urn:schemas-microsoft-com:vml" xmlns:wp14="http://schemas.microsoft.com/office/word/2010/wordprocessingDrawing" xmlns:wp="http://schemas.openxmlformats.org/drawingml/2006/wordprocessingDrawing" xmlns:w10="urn:schemas-microsoft-com:office:word" xmlns:w="http://schemas.openxmlformats.org/wordprocessingml/2006/main" xmlns:w14="http://schemas.microsoft.com/office/word/2010/wordml" xmlns:w15="http://schemas.microsoft.com/office/word/2012/wordml" xmlns:w16cex="http://schemas.microsoft.com/office/word/2018/wordml/cex" xmlns:w16cid="http://schemas.microsoft.com/office/word/2016/wordml/cid" xmlns:w16="http://schemas.microsoft.com/office/word/2018/wordml" xmlns:w16du="http://schemas.microsoft.com/office/word/2023/wordml/word16du" xmlns:w16sdtdh="http://schemas.microsoft.com/office/word/2020/wordml/sdtdatahash" xmlns:w16sdtfl="http://schemas.microsoft.com/office/word/2024/wordml/sdtformatlock" xmlns:w16se="http://schemas.microsoft.com/office/word/2015/wordml/symex" xmlns:wpg="http://schemas.microsoft.com/office/word/2010/wordprocessingGroup" xmlns:wpi="http://schemas.microsoft.com/office/word/2010/wordprocessingInk" xmlns:wne="http://schemas.microsoft.com/office/word/2006/wordml" xmlns:wps="http://schemas.microsoft.com/office/word/2010/wordprocessingShape" mc:Ignorable="w14 w15 w16se w16cid w16 w16cex w16sdtdh w16sdtfl w16du wp14">
+  <w:p>
+    <w:pPr>
+      <w:pStyle w:val="Kopfzeile"/>
+      <w:rPr>
+        <w:lang w:val="de-DE"/>
+      </w:rPr>
+    </w:pPr>
+    <w:r>
+      <w:rPr>
+        <w:lang w:val="de-DE"/>
+      </w:rPr>
+      <w:t>Simon Humer</w:t>
+    </w:r>
+    <w:r>
+      <w:rPr>
+        <w:lang w:val="de-DE"/>
+      </w:rPr>
+      <w:tab/>
+      <w:t>WMC-Protokoll-2</w:t>
+    </w:r>
+    <w:r>
+      <w:rPr>
+        <w:lang w:val="de-DE"/>
+      </w:rPr>
+      <w:tab/>
+      <w:t>4C</w:t>
+    </w:r>
+  </w:p>
+</w:hdr>
 </file>
 
 <file path=word/numbering.xml><?xml version="1.0" encoding="utf-8"?>
@@ -141,7 +727,7 @@
         <w:rFonts w:ascii="Symbol" w:eastAsiaTheme="minorHAnsi" w:hAnsi="Symbol" w:cstheme="minorBidi" w:hint="default"/>
       </w:rPr>
     </w:lvl>
-    <w:lvl w:ilvl="1" w:tplc="08090003" w:tentative="1">
+    <w:lvl w:ilvl="1" w:tplc="08090003">
       <w:start w:val="1"/>
       <w:numFmt w:val="bullet"/>
       <w:lvlText w:val="o"/>
@@ -238,8 +824,100 @@
       </w:rPr>
     </w:lvl>
   </w:abstractNum>
+  <w:abstractNum w:abstractNumId="1" w15:restartNumberingAfterBreak="0">
+    <w:nsid w:val="4A1E28CA"/>
+    <w:multiLevelType w:val="hybridMultilevel"/>
+    <w:tmpl w:val="3AF4295E"/>
+    <w:lvl w:ilvl="0" w:tplc="963CF2DA">
+      <w:start w:val="1"/>
+      <w:numFmt w:val="decimal"/>
+      <w:lvlText w:val="%1)"/>
+      <w:lvlJc w:val="left"/>
+      <w:pPr>
+        <w:ind w:left="1080" w:hanging="360"/>
+      </w:pPr>
+      <w:rPr>
+        <w:rFonts w:hint="default"/>
+      </w:rPr>
+    </w:lvl>
+    <w:lvl w:ilvl="1" w:tplc="08090019" w:tentative="1">
+      <w:start w:val="1"/>
+      <w:numFmt w:val="lowerLetter"/>
+      <w:lvlText w:val="%2."/>
+      <w:lvlJc w:val="left"/>
+      <w:pPr>
+        <w:ind w:left="1800" w:hanging="360"/>
+      </w:pPr>
+    </w:lvl>
+    <w:lvl w:ilvl="2" w:tplc="0809001B" w:tentative="1">
+      <w:start w:val="1"/>
+      <w:numFmt w:val="lowerRoman"/>
+      <w:lvlText w:val="%3."/>
+      <w:lvlJc w:val="right"/>
+      <w:pPr>
+        <w:ind w:left="2520" w:hanging="180"/>
+      </w:pPr>
+    </w:lvl>
+    <w:lvl w:ilvl="3" w:tplc="0809000F" w:tentative="1">
+      <w:start w:val="1"/>
+      <w:numFmt w:val="decimal"/>
+      <w:lvlText w:val="%4."/>
+      <w:lvlJc w:val="left"/>
+      <w:pPr>
+        <w:ind w:left="3240" w:hanging="360"/>
+      </w:pPr>
+    </w:lvl>
+    <w:lvl w:ilvl="4" w:tplc="08090019" w:tentative="1">
+      <w:start w:val="1"/>
+      <w:numFmt w:val="lowerLetter"/>
+      <w:lvlText w:val="%5."/>
+      <w:lvlJc w:val="left"/>
+      <w:pPr>
+        <w:ind w:left="3960" w:hanging="360"/>
+      </w:pPr>
+    </w:lvl>
+    <w:lvl w:ilvl="5" w:tplc="0809001B" w:tentative="1">
+      <w:start w:val="1"/>
+      <w:numFmt w:val="lowerRoman"/>
+      <w:lvlText w:val="%6."/>
+      <w:lvlJc w:val="right"/>
+      <w:pPr>
+        <w:ind w:left="4680" w:hanging="180"/>
+      </w:pPr>
+    </w:lvl>
+    <w:lvl w:ilvl="6" w:tplc="0809000F" w:tentative="1">
+      <w:start w:val="1"/>
+      <w:numFmt w:val="decimal"/>
+      <w:lvlText w:val="%7."/>
+      <w:lvlJc w:val="left"/>
+      <w:pPr>
+        <w:ind w:left="5400" w:hanging="360"/>
+      </w:pPr>
+    </w:lvl>
+    <w:lvl w:ilvl="7" w:tplc="08090019" w:tentative="1">
+      <w:start w:val="1"/>
+      <w:numFmt w:val="lowerLetter"/>
+      <w:lvlText w:val="%8."/>
+      <w:lvlJc w:val="left"/>
+      <w:pPr>
+        <w:ind w:left="6120" w:hanging="360"/>
+      </w:pPr>
+    </w:lvl>
+    <w:lvl w:ilvl="8" w:tplc="0809001B" w:tentative="1">
+      <w:start w:val="1"/>
+      <w:numFmt w:val="lowerRoman"/>
+      <w:lvlText w:val="%9."/>
+      <w:lvlJc w:val="right"/>
+      <w:pPr>
+        <w:ind w:left="6840" w:hanging="180"/>
+      </w:pPr>
+    </w:lvl>
+  </w:abstractNum>
   <w:num w:numId="1" w16cid:durableId="1278951333">
     <w:abstractNumId w:val="0"/>
+  </w:num>
+  <w:num w:numId="2" w16cid:durableId="38626288">
+    <w:abstractNumId w:val="1"/>
   </w:num>
 </w:numbering>
 </file>
@@ -1161,6 +1839,50 @@
       <w:spacing w:val="5"/>
     </w:rPr>
   </w:style>
+  <w:style w:type="paragraph" w:styleId="Kopfzeile">
+    <w:name w:val="header"/>
+    <w:basedOn w:val="Standard"/>
+    <w:link w:val="KopfzeileZchn"/>
+    <w:uiPriority w:val="99"/>
+    <w:unhideWhenUsed/>
+    <w:rsid w:val="005056D6"/>
+    <w:pPr>
+      <w:tabs>
+        <w:tab w:val="center" w:pos="4536"/>
+        <w:tab w:val="right" w:pos="9072"/>
+      </w:tabs>
+      <w:spacing w:after="0" w:line="240" w:lineRule="auto"/>
+    </w:pPr>
+  </w:style>
+  <w:style w:type="character" w:customStyle="1" w:styleId="KopfzeileZchn">
+    <w:name w:val="Kopfzeile Zchn"/>
+    <w:basedOn w:val="Absatz-Standardschriftart"/>
+    <w:link w:val="Kopfzeile"/>
+    <w:uiPriority w:val="99"/>
+    <w:rsid w:val="005056D6"/>
+  </w:style>
+  <w:style w:type="paragraph" w:styleId="Fuzeile">
+    <w:name w:val="footer"/>
+    <w:basedOn w:val="Standard"/>
+    <w:link w:val="FuzeileZchn"/>
+    <w:uiPriority w:val="99"/>
+    <w:unhideWhenUsed/>
+    <w:rsid w:val="005056D6"/>
+    <w:pPr>
+      <w:tabs>
+        <w:tab w:val="center" w:pos="4536"/>
+        <w:tab w:val="right" w:pos="9072"/>
+      </w:tabs>
+      <w:spacing w:after="0" w:line="240" w:lineRule="auto"/>
+    </w:pPr>
+  </w:style>
+  <w:style w:type="character" w:customStyle="1" w:styleId="FuzeileZchn">
+    <w:name w:val="Fußzeile Zchn"/>
+    <w:basedOn w:val="Absatz-Standardschriftart"/>
+    <w:link w:val="Fuzeile"/>
+    <w:uiPriority w:val="99"/>
+    <w:rsid w:val="005056D6"/>
+  </w:style>
 </w:styles>
 </file>
 

</xml_diff>